<commit_message>
fix(docs): fix Word corrupt XML error in DOCX generation and add RTF (.rtf) support across all documents
</commit_message>
<xml_diff>
--- a/public/downloads/lezingen/devarim-lezing-nl.docx
+++ b/public/downloads/lezingen/devarim-lezing-nl.docx
@@ -13,16 +13,15 @@
       </w:pPr>
       <w:r>
         <w:rPr/>
-        <w:t xml:space="preserve"/>
-      </w:r>
-    </w:p>
-    <w:p>
-      <w:pPr>
-        <w:spacing w:lineRule="auto"/>
-      </w:pPr>
-      <w:r>
-        <w:rPr/>
-        <w:t xml:space="preserve">Lezing &amp; Toelichting</w:t>
+        <w:t xml:space="preserve">     </w:t>
+      </w:r>
+    </w:p>
+    <w:p>
+      <w:pPr>
+        <w:spacing w:lineRule="auto"/>
+      </w:pPr>
+      <w:r>
+        <w:rPr/>
       </w:r>
     </w:p>
     <w:p>
@@ -40,62 +39,7 @@
         <w:spacing w:lineRule="auto"/>
       </w:pPr>
       <w:r>
-        <w:rPr>
-          <w:b/>
-        </w:rPr>
-        <w:t xml:space="preserve">Tora:</w:t>
-      </w:r>
-      <w:r>
-        <w:rPr/>
-        <w:t xml:space="preserve"> Deuteronomium 1:1–3:22</w:t>
-      </w:r>
-    </w:p>
-    <w:p>
-      <w:pPr>
-        <w:spacing w:lineRule="auto"/>
-      </w:pPr>
-      <w:r>
-        <w:rPr/>
-        <w:t xml:space="preserve">  ·  </w:t>
-      </w:r>
-    </w:p>
-    <w:p>
-      <w:pPr>
-        <w:spacing w:lineRule="auto"/>
-      </w:pPr>
-      <w:r>
-        <w:rPr>
-          <w:b/>
-        </w:rPr>
-        <w:t xml:space="preserve">Haftara:</w:t>
-      </w:r>
-      <w:r>
-        <w:rPr/>
-        <w:t xml:space="preserve"> Jesaja 1:1–27</w:t>
-      </w:r>
-    </w:p>
-    <w:p>
-      <w:pPr>
-        <w:spacing w:lineRule="auto"/>
-      </w:pPr>
-      <w:r>
-        <w:rPr/>
-        <w:t xml:space="preserve">  ·  </w:t>
-      </w:r>
-    </w:p>
-    <w:p>
-      <w:pPr>
-        <w:spacing w:lineRule="auto"/>
-      </w:pPr>
-      <w:r>
-        <w:rPr>
-          <w:b/>
-        </w:rPr>
-        <w:t xml:space="preserve">Evangelie:</w:t>
-      </w:r>
-      <w:r>
-        <w:rPr/>
-        <w:t xml:space="preserve"> Lucas 19:41–44</w:t>
+        <w:rPr/>
       </w:r>
     </w:p>
     <w:p>
@@ -796,15 +740,6 @@
       <w:r>
         <w:rPr/>
         <w:t xml:space="preserve">Lees het na, denk erover — en zeg me gerust waar jij het anders zou leggen dan ik.</w:t>
-      </w:r>
-    </w:p>
-    <w:p>
-      <w:pPr>
-        <w:spacing w:lineRule="auto"/>
-      </w:pPr>
-      <w:r>
-        <w:rPr/>
-        <w:t xml:space="preserve">     zelfdeparasjalezen.netlify.app — © Arie Alberts   </w:t>
       </w:r>
     </w:p>
   </w:body>

</xml_diff>